<commit_message>
update acount hold and bank code
</commit_message>
<xml_diff>
--- a/Bao_cao_Phan_ra_Du_lieu_Thu_Chi.docx
+++ b/Bao_cao_Phan_ra_Du_lieu_Thu_Chi.docx
@@ -346,7 +346,7 @@
     </w:p>
     <w:p>
       <w:r>
-        <w:t>Từ đây suy ra ngay: ngày (chuẩn hoá ISO yyyy-mm-dd), tài khoản, hướng thu/chi (dựa vào dấu +/-, xem là nguồn sự thật — không suy luận lại từ câu chữ), và số tiền (int, đã bỏ dấu phẩy).</w:t>
+        <w:t>Từ đây suy ra ngay: ngày (chuẩn hoá ISO yyyy-mm-dd), tài khoản, hướng thu/chi (dựa vào dấu +/-, xem là nguồn sự thật — không suy luận lại từ câu chữ), và số tiền (int, đã bỏ dấu phẩy). Trường tài khoản (vd "Hương.acb") được tách tiếp thành account_holder (tên chủ tài khoản, "Hương") và bank_code (mã ngân hàng, "acb") bằng account.rsplit(".", 1) — tách theo dấu chấm cuối cùng vì tên chủ tài khoản không chứa dấu chấm — phục vụ thống kê dòng tiền theo từng ngân hàng.</w:t>
       </w:r>
     </w:p>
     <w:p>
@@ -1143,6 +1143,10 @@
         <w:br/>
         <w:t xml:space="preserve">  "account": "Anh.ocb",</w:t>
         <w:br/>
+        <w:t xml:space="preserve">  "account_holder": "Anh",</w:t>
+        <w:br/>
+        <w:t xml:space="preserve">  "bank_code": "ocb",</w:t>
+        <w:br/>
         <w:t xml:space="preserve">  "direction": "chi",</w:t>
         <w:br/>
         <w:t xml:space="preserve">  "amount": 440000,</w:t>
@@ -1798,7 +1802,7 @@
         <w:pStyle w:val="ListBullet"/>
       </w:pPr>
       <w:r>
-        <w:t>Bảng tra cứu tài khoản riêng: map nickname (vd “Xuân.svl”) sang tên chủ tài khoản/số tài khoản đầy đủ/ngân hàng thật, tách biệt khỏi logic phân rã.</w:t>
+        <w:t>Bảng tra cứu tài khoản riêng: đã tách nickname (vd "Xuân.svl") thành account_holder + bank_code ngay trong extract_transactions.py; còn thiếu bước map bank_code sang tên ngân hàng thật đầy đủ (vd "acb" → "ACB - Ngân hàng Á Châu") và số tài khoản thật, nên vẫn để trong một bảng tra cứu riêng, tách biệt khỏi logic phân rã.</w:t>
       </w:r>
     </w:p>
     <w:p>

</xml_diff>